<commit_message>
Creazione palestra delle scorciatoie e refactoring
</commit_message>
<xml_diff>
--- a/00_GUIDA_DOCENTE/GUIDA_DOCENTE_MISSIONE_0.docx
+++ b/00_GUIDA_DOCENTE/GUIDA_DOCENTE_MISSIONE_0.docx
@@ -2545,46 +2545,59 @@
               <w:rPr>
                 <w:sz w:val="20"/>
               </w:rPr>
-              <w:t xml:space="preserve">Da Classroom scarica </w:t>
+              <w:t xml:space="preserve">Apri dal link della traccia della Consegna 01 la </w:t>
             </w:r>
             <w:r>
               <w:rPr>
                 <w:b/>
                 <w:sz w:val="20"/>
               </w:rPr>
-              <w:t>typing_officina23.html</w:t>
+              <w:t>palestra della tastiera</w:t>
             </w:r>
             <w:r>
               <w:rPr>
                 <w:sz w:val="20"/>
               </w:rPr>
-              <w:t xml:space="preserve"> e aprilo con doppio clic: si apre in Chrome? Premi </w:t>
+              <w:t xml:space="preserve"> e quella </w:t>
             </w:r>
             <w:r>
               <w:rPr>
                 <w:b/>
                 <w:sz w:val="20"/>
               </w:rPr>
-              <w:t>Nuovo studente</w:t>
+              <w:t>delle scorciatoie</w:t>
             </w:r>
             <w:r>
               <w:rPr>
                 <w:sz w:val="20"/>
               </w:rPr>
-              <w:t xml:space="preserve"> e fai 10 secondi di test. Fai lo stesso con </w:t>
+              <w:t xml:space="preserve">: si aprono in Chrome? Premi </w:t>
             </w:r>
             <w:r>
               <w:rPr>
                 <w:b/>
                 <w:sz w:val="20"/>
               </w:rPr>
-              <w:t>selezione_officina23.html</w:t>
+              <w:t>Nuovo studente</w:t>
             </w:r>
             <w:r>
               <w:rPr>
                 <w:sz w:val="20"/>
               </w:rPr>
-              <w:t xml:space="preserve"> (Lezione 2): prova un doppio clic su una parola.</w:t>
+              <w:t xml:space="preserve">, fai 10 secondi di test e, nelle scorciatoie, un Ctrl+F. Fai lo stesso con la </w:t>
+            </w:r>
+            <w:r>
+              <w:rPr>
+                <w:b/>
+                <w:sz w:val="20"/>
+              </w:rPr>
+              <w:t>palestra della selezione</w:t>
+            </w:r>
+            <w:r>
+              <w:rPr>
+                <w:sz w:val="20"/>
+              </w:rPr>
+              <w:t xml:space="preserve"> (Consegna 03). Se il sito è bloccato dal filtro della scuola, prova i file scaricati da Classroom (doppio clic): sono la riserva offline.</w:t>
             </w:r>
           </w:p>
         </w:tc>
@@ -2788,20 +2801,20 @@
               <w:rPr>
                 <w:sz w:val="20"/>
               </w:rPr>
-              <w:t xml:space="preserve">Apri </w:t>
+              <w:t xml:space="preserve">Apri la </w:t>
             </w:r>
             <w:r>
               <w:rPr>
                 <w:b/>
                 <w:sz w:val="20"/>
               </w:rPr>
-              <w:t>posta_officina23.html</w:t>
+              <w:t>casella di posta</w:t>
             </w:r>
             <w:r>
               <w:rPr>
                 <w:sz w:val="20"/>
               </w:rPr>
-              <w:t>: passando il mouse sul pulsante blu compare un indirizzo in basso a sinistra?</w:t>
+              <w:t xml:space="preserve"> (link della Consegna 06, oppure posta_officina23.html): passando il mouse sul pulsante blu compare un indirizzo in basso a sinistra?</w:t>
             </w:r>
           </w:p>
         </w:tc>
@@ -4327,7 +4340,7 @@
       </w:pPr>
       <w:r>
         <w:rPr/>
-        <w:t>☐  Hai provato lo strumento di digitazione e l'estrazione dello ZIP (sezione 4).</w:t>
+        <w:t>☐  Hai provato le palestre della tastiera e delle scorciatoie (dal link e dal file) e l'estrazione dello ZIP (sezione 4).</w:t>
       </w:r>
     </w:p>
     <w:p>
@@ -4935,7 +4948,7 @@
               <w:rPr>
                 <w:sz w:val="19"/>
               </w:rPr>
-              <w:t>Palestra delle scorciatoie sul listino</w:t>
+              <w:t>Palestra delle scorciatoie (Blocco note simulato, 6 sfide)</w:t>
             </w:r>
           </w:p>
         </w:tc>
@@ -4969,7 +4982,7 @@
               <w:rPr>
                 <w:sz w:val="19"/>
               </w:rPr>
-              <w:t>Osserva chi usa davvero Ctrl+X/Ctrl+V (2.1)</w:t>
+              <w:t>Lo strumento registra se usano le scorciatoie o il mouse: tu osserva chi si blocca sulla sfida 2 (spostare le righe)</w:t>
             </w:r>
           </w:p>
         </w:tc>
@@ -5361,7 +5374,7 @@
       </w:r>
       <w:r>
         <w:rPr/>
-        <w:t xml:space="preserve"> È un file HTML che funziona senza internet. Se Classroom lo apre in anteprima, si usa l'icona Scarica. Ogni studente all'inizio preme </w:t>
+        <w:t xml:space="preserve"> È una pagina HTML: gli studenti la aprono dal link nella traccia oppure scaricano il file allegato e lo aprono con doppio clic (funziona anche senza internet; se Classroom apre l'anteprima si usa l'icona Scarica). Ogni studente all'inizio preme </w:t>
       </w:r>
       <w:r>
         <w:rPr>
@@ -5382,6 +5395,22 @@
       <w:r>
         <w:rPr/>
         <w:t xml:space="preserve"> nella scheda: potete verificarlo nella scheda Riepilogo › Area docente.</w:t>
+      </w:r>
+    </w:p>
+    <w:p>
+      <w:pPr>
+        <w:pStyle w:val="ListBullet"/>
+        <w:spacing w:after="60"/>
+      </w:pPr>
+      <w:r>
+        <w:rPr>
+          <w:b/>
+        </w:rPr>
+        <w:t>Palestra delle scorciatoie.</w:t>
+      </w:r>
+      <w:r>
+        <w:rPr/>
+        <w:t xml:space="preserve"> Stesso funzionamento (link o file, Nuovo studente, codice O23-SCO verificabile). È un Blocco note simulato con il listino di 192 righe e 6 sfide: trova, sposta, copia, prova di coraggio (Ctrl+A e Ctrl+Z), conta, salva e salva con nome. Lo strumento controlla il risultato e registra se ogni sfida è stata fatta con le scorciatoie o con il mouse. Il salvataggio è simulato: non c'è un file .txt da consegnare e la 2.4 si osserva nella simulazione. Se lo strumento non si apre: listino_da_sistemare.txt nel Blocco note vero (piano B, sezione 13).</w:t>
       </w:r>
     </w:p>
     <w:p>
@@ -5459,7 +5488,7 @@
     <w:p>
       <w:r>
         <w:rPr/>
-        <w:t>1.1 posizione delle mani · 1.2–1.5 dal codice risultato · 2.1–2.4 dal listino consegnato · 3.1–3.7 dallo ZIP (checklist rapida in 8 controlli nelle soluzioni) · 4.1–4.4 dalla scheda B.</w:t>
+        <w:t>1.1 posizione delle mani · 1.2–1.5 dal codice risultato · 2.1–2.4 dal codice O23-SCO (SPOSTA e COPIA → 2.1, ANNULLA → 2.2, TROVA e CONTA → 2.3, SALVA → 2.4) · 3.1–3.7 dallo ZIP (checklist rapida in 8 controlli nelle soluzioni) · 4.1–4.4 dalla scheda B.</w:t>
       </w:r>
     </w:p>
     <w:p>
@@ -6693,7 +6722,7 @@
       </w:r>
       <w:r>
         <w:rPr/>
-        <w:t xml:space="preserve"> È uno strumento offline come quello di digitazione (si scarica e si apre con doppio clic; ognuno preme Nuovo studente). 8 sfide sui file in un Esplora file simulato con i file della chiavetta di Marta e 8 sul testo: 3 stelle solo con la tecnica richiesta. Serve a entrare nella lezione: chi seleziona bene formatta bene. Tempo: </w:t>
+        <w:t xml:space="preserve"> È uno strumento offline come quello di digitazione (si apre dal link nella traccia o dal file allegato; ognuno preme Nuovo studente). 8 sfide sui file in un Esplora file simulato con i file della chiavetta di Marta e 8 sul testo: 3 stelle solo con la tecnica richiesta. Serve a entrare nella lezione: chi seleziona bene formatta bene. Tempo: </w:t>
       </w:r>
       <w:r>
         <w:rPr>
@@ -11974,7 +12003,7 @@
               <w:rPr>
                 <w:sz w:val="19"/>
               </w:rPr>
-              <w:t>Gli strumenti HTML (digitazione, selezione) non si aprono</w:t>
+              <w:t>Gli strumenti HTML (digitazione, scorciatoie, selezione) non si aprono</w:t>
             </w:r>
           </w:p>
         </w:tc>
@@ -11991,7 +12020,7 @@
               <w:rPr>
                 <w:sz w:val="19"/>
               </w:rPr>
-              <w:t>Apriteli con Edge. Per la digitazione, in alternativa, un sito di digitazione in italiano scelto da voi; per la selezione, le stesse sfide su una cartella vera e su un Documento Google, con il docente che osserva.</w:t>
+              <w:t>Se il link non si apre (rete o filtro della scuola), si usa il file allegato con doppio clic; se non va neanche quello, provate Edge. In alternativa: per la digitazione un sito di digitazione in italiano scelto da voi; per le scorciatoie listino_da_sistemare.txt nel Blocco note vero con le stesse 6 operazioni (chiave: SOLUZIONE_listino_sistemato.txt); per la selezione le stesse sfide su una cartella vera e su un Documento Google, con il docente che osserva.</w:t>
             </w:r>
           </w:p>
         </w:tc>

</xml_diff>

<commit_message>
Verifica codici + generazione modulo raccolta codici
</commit_message>
<xml_diff>
--- a/00_GUIDA_DOCENTE/GUIDA_DOCENTE_MISSIONE_0.docx
+++ b/00_GUIDA_DOCENTE/GUIDA_DOCENTE_MISSIONE_0.docx
@@ -9332,7 +9332,7 @@
       </w:r>
       <w:r>
         <w:rPr/>
-        <w:t xml:space="preserve"> Tutti i messaggi sono inventati e i domini finiscono con .example (non esistono). Nessun link è reale: cliccando compare un avviso.</w:t>
+        <w:t xml:space="preserve"> Tutti i messaggi sono inventati e i domini finiscono con .example (non esistono). Nessun link è reale: cliccando compare un avviso. Gli studenti decidono nella casella («È affidabile» / «È phishing»): la casella non dice se è giusto; il codice O23-PHI registra decisioni, controlli e clic.</w:t>
       </w:r>
     </w:p>
     <w:p>
@@ -9610,7 +9610,7 @@
     <w:p>
       <w:r>
         <w:rPr/>
-        <w:t>9.1–9.3 dalla scheda phishing (domini veri, indizi, azione, verifica) e dal contatore dei clic · 4.5 tabella delle decisioni · 8.1 cartella Drive con 2 foto e video rinominati · 8.2 link che si apre in sola visualizzazione · 8.3 diagnosi dei 3 casi · 8.4 gli 8 elementi dell'email · 8.5 checklist firmata dal compagno.</w:t>
+        <w:t>9.1–9.3 dalla scheda phishing (domini veri, indizi, azione, verifica) e dal codice O23-PHI (decisioni, controlli, clic) · 4.5 tabella delle decisioni · 8.1 cartella Drive con 2 foto e video rinominati · 8.2 link che si apre in sola visualizzazione · 8.3 diagnosi dei 3 casi · 8.4 gli 8 elementi dell'email · 8.5 checklist firmata dal compagno.</w:t>
       </w:r>
     </w:p>
     <w:p>
@@ -10297,6 +10297,22 @@
       <w:r>
         <w:rPr/>
         <w:t xml:space="preserve"> Nel REGISTRO_CLASSE_OSSERVAZIONI.docx c'è una tabella per lezione con i codici delle microcompetenze osservate: scrivete A, S o N e 'a' se lo studente ha ricevuto aiuto.</w:t>
+      </w:r>
+    </w:p>
+    <w:p>
+      <w:pPr>
+        <w:pStyle w:val="ListBullet"/>
+        <w:spacing w:after="60"/>
+      </w:pPr>
+      <w:r>
+        <w:rPr>
+          <w:b/>
+        </w:rPr>
+        <w:t>Codici degli strumenti.</w:t>
+      </w:r>
+      <w:r>
+        <w:rPr/>
+        <w:t xml:space="preserve"> Con il Modulo Google «Missione 0 · codici risultato» (istruzioni in verifica_codici.html, nella cartella principale) raccogliete i codici O23-L1, O23-SCO, O23-SEL, O23-PHI e O23-PMF. Incollate le risposte in verifica_codici.html: controlla la firma e propone i livelli di 1.2–1.4, 2.1–2.6 e 9.1–9.2. Nulla viene inviato: tutto resta nel browser.</w:t>
       </w:r>
     </w:p>
     <w:p>

</xml_diff>